<commit_message>
se cambio la conexion a la base de datos
</commit_message>
<xml_diff>
--- a/plantillas/venta_contrato_vehiculo_PJ_v2.docx
+++ b/plantillas/venta_contrato_vehiculo_PJ_v2.docx
@@ -523,8 +523,13 @@
       <w:r>
         <w:t>${</w:t>
       </w:r>
-      <w:r>
-        <w:t>m_f}</w:t>
+      <w:proofErr w:type="spellStart"/>
+      <w:r>
+        <w:t>m_f</w:t>
+      </w:r>
+      <w:proofErr w:type="spellEnd"/>
+      <w:r>
+        <w:t>}</w:t>
       </w:r>
       <w:permEnd w:id="2009561265"/>
       <w:r>

</xml_diff>

<commit_message>
Enhance JSON encoding in contract generation with error handling and data sanitization
</commit_message>
<xml_diff>
--- a/plantillas/venta_contrato_vehiculo_PJ_v2.docx
+++ b/plantillas/venta_contrato_vehiculo_PJ_v2.docx
@@ -687,9 +687,9 @@
       </w:tblPr>
       <w:tblGrid>
         <w:gridCol w:w="1327"/>
-        <w:gridCol w:w="2235"/>
-        <w:gridCol w:w="1597"/>
-        <w:gridCol w:w="2393"/>
+        <w:gridCol w:w="1650"/>
+        <w:gridCol w:w="1701"/>
+        <w:gridCol w:w="2874"/>
         <w:gridCol w:w="991"/>
         <w:gridCol w:w="2247"/>
       </w:tblGrid>
@@ -717,7 +717,7 @@
         </w:tc>
         <w:tc>
           <w:tcPr>
-            <w:tcW w:w="2235" w:type="dxa"/>
+            <w:tcW w:w="1650" w:type="dxa"/>
           </w:tcPr>
           <w:p>
             <w:pPr>
@@ -738,7 +738,7 @@
         </w:tc>
         <w:tc>
           <w:tcPr>
-            <w:tcW w:w="1597" w:type="dxa"/>
+            <w:tcW w:w="1701" w:type="dxa"/>
           </w:tcPr>
           <w:p>
             <w:pPr>
@@ -759,7 +759,7 @@
         </w:tc>
         <w:tc>
           <w:tcPr>
-            <w:tcW w:w="2393" w:type="dxa"/>
+            <w:tcW w:w="2874" w:type="dxa"/>
           </w:tcPr>
           <w:p>
             <w:pPr>
@@ -845,7 +845,7 @@
         </w:tc>
         <w:tc>
           <w:tcPr>
-            <w:tcW w:w="2235" w:type="dxa"/>
+            <w:tcW w:w="1650" w:type="dxa"/>
           </w:tcPr>
           <w:p>
             <w:pPr>
@@ -866,7 +866,7 @@
         </w:tc>
         <w:tc>
           <w:tcPr>
-            <w:tcW w:w="1597" w:type="dxa"/>
+            <w:tcW w:w="1701" w:type="dxa"/>
           </w:tcPr>
           <w:p>
             <w:pPr>
@@ -887,7 +887,7 @@
         </w:tc>
         <w:tc>
           <w:tcPr>
-            <w:tcW w:w="2393" w:type="dxa"/>
+            <w:tcW w:w="2874" w:type="dxa"/>
           </w:tcPr>
           <w:p>
             <w:pPr>
@@ -979,7 +979,7 @@
         </w:tc>
         <w:tc>
           <w:tcPr>
-            <w:tcW w:w="2235" w:type="dxa"/>
+            <w:tcW w:w="1650" w:type="dxa"/>
           </w:tcPr>
           <w:p>
             <w:pPr>
@@ -1004,7 +1004,7 @@
         </w:tc>
         <w:tc>
           <w:tcPr>
-            <w:tcW w:w="1597" w:type="dxa"/>
+            <w:tcW w:w="1701" w:type="dxa"/>
           </w:tcPr>
           <w:p>
             <w:pPr>
@@ -1033,7 +1033,7 @@
         </w:tc>
         <w:tc>
           <w:tcPr>
-            <w:tcW w:w="2393" w:type="dxa"/>
+            <w:tcW w:w="2874" w:type="dxa"/>
           </w:tcPr>
           <w:p>
             <w:pPr>
@@ -1129,7 +1129,7 @@
         </w:tc>
         <w:tc>
           <w:tcPr>
-            <w:tcW w:w="2235" w:type="dxa"/>
+            <w:tcW w:w="1650" w:type="dxa"/>
           </w:tcPr>
           <w:p>
             <w:pPr>
@@ -1150,7 +1150,7 @@
         </w:tc>
         <w:tc>
           <w:tcPr>
-            <w:tcW w:w="1597" w:type="dxa"/>
+            <w:tcW w:w="1701" w:type="dxa"/>
           </w:tcPr>
           <w:p>
             <w:pPr>
@@ -1171,7 +1171,7 @@
         </w:tc>
         <w:tc>
           <w:tcPr>
-            <w:tcW w:w="2393" w:type="dxa"/>
+            <w:tcW w:w="2874" w:type="dxa"/>
           </w:tcPr>
           <w:p>
             <w:pPr>
@@ -1437,7 +1437,14 @@
         <w:rPr>
           <w:rFonts w:cstheme="minorHAnsi"/>
         </w:rPr>
-        <w:t xml:space="preserve">Para hacer efectiva la garantía mecánica establecida en la cláusula SÉPTIMA, EL COMPRADOR deberá:  </w:t>
+        <w:t xml:space="preserve">Para </w:t>
+      </w:r>
+      <w:r>
+        <w:rPr>
+          <w:rFonts w:cstheme="minorHAnsi"/>
+        </w:rPr>
+        <w:lastRenderedPageBreak/>
+        <w:t xml:space="preserve">hacer efectiva la garantía mecánica establecida en la cláusula SÉPTIMA, EL COMPRADOR deberá:  </w:t>
       </w:r>
       <w:r>
         <w:rPr>
@@ -1451,14 +1458,7 @@
         <w:rPr>
           <w:rFonts w:cstheme="minorHAnsi"/>
         </w:rPr>
-        <w:t xml:space="preserve"> Notificar </w:t>
-      </w:r>
-      <w:r>
-        <w:rPr>
-          <w:rFonts w:cstheme="minorHAnsi"/>
-        </w:rPr>
-        <w:lastRenderedPageBreak/>
-        <w:t xml:space="preserve">inmediatamente por escrito o por cualquier medio a EL VENDEDOR dentro de las veinticuatro (24) horas siguientes de detectado el desperfecto </w:t>
+        <w:t xml:space="preserve"> Notificar inmediatamente por escrito o por cualquier medio a EL VENDEDOR dentro de las veinticuatro (24) horas siguientes de detectado el desperfecto </w:t>
       </w:r>
       <w:r>
         <w:rPr>

</xml_diff>